<commit_message>
Correct details in laboratory report
</commit_message>
<xml_diff>
--- a/КЗП_КІ-302_Куницький_ЛР_1.docx
+++ b/КЗП_КІ-302_Куницький_ЛР_1.docx
@@ -69,7 +69,7 @@
           <v:shape id="ole_rId2" o:spid="_x0000_i1025" type="#_x0000_t75" style="width:239pt;height:282pt;visibility:visible;mso-wrap-distance-right:0" o:ole="">
             <v:imagedata r:id="rId8" o:title=""/>
           </v:shape>
-          <o:OLEObject Type="Embed" ProgID="StaticMetafile" ShapeID="ole_rId2" DrawAspect="Content" ObjectID="_1852143654" r:id="rId9"/>
+          <o:OLEObject Type="Embed" ProgID="StaticMetafile" ShapeID="ole_rId2" DrawAspect="Content" ObjectID="_1852145435" r:id="rId9"/>
         </w:object>
       </w:r>
     </w:p>
@@ -83,25 +83,20 @@
     </w:p>
     <w:p>
       <w:pPr>
-        <w:pStyle w:val="aff8"/>
-      </w:pPr>
-      <w:r>
-        <w:t xml:space="preserve">з </w:t>
-      </w:r>
-      <w:r>
-        <w:t>лАБОРАТОРНОЇ РОБОТИ</w:t>
-      </w:r>
-      <w:r>
-        <w:t xml:space="preserve"> </w:t>
-      </w:r>
-      <w:r>
-        <w:rPr>
-          <w:lang w:val="ru-RU"/>
-        </w:rPr>
-        <w:t>№</w:t>
-      </w:r>
-      <w:r>
-        <w:t>1</w:t>
+        <w:pStyle w:val="aff7"/>
+        <w:rPr>
+          <w:b/>
+          <w:caps/>
+          <w:kern w:val="2"/>
+        </w:rPr>
+      </w:pPr>
+      <w:r>
+        <w:rPr>
+          <w:b/>
+          <w:caps/>
+          <w:kern w:val="2"/>
+        </w:rPr>
+        <w:t>з лабораторної роботи № 1</w:t>
       </w:r>
     </w:p>
     <w:p>
@@ -750,75 +745,21 @@
         <w:jc w:val="left"/>
         <w:rPr>
           <w:rFonts w:ascii="Arial" w:hAnsi="Arial" w:cs="Arial"/>
-          <w:szCs w:val="24"/>
-          <w:lang w:val="uk-UA" w:eastAsia="uk-UA"/>
-        </w:rPr>
-      </w:pPr>
-      <w:r>
-        <w:rPr>
-          <w:rFonts w:ascii="Arial" w:hAnsi="Arial" w:cs="Arial"/>
           <w:b/>
           <w:bCs/>
           <w:szCs w:val="24"/>
           <w:lang w:val="uk-UA" w:eastAsia="uk-UA"/>
         </w:rPr>
-        <w:t>Пакети та файли:</w:t>
-      </w:r>
-      <w:r>
-        <w:rPr>
-          <w:rFonts w:ascii="Arial" w:hAnsi="Arial" w:cs="Arial"/>
-          <w:szCs w:val="24"/>
-          <w:lang w:val="uk-UA" w:eastAsia="uk-UA"/>
-        </w:rPr>
-        <w:t xml:space="preserve"> Проєкт містить головний клас </w:t>
-      </w:r>
-      <w:r>
-        <w:rPr>
-          <w:rFonts w:ascii="Arial" w:hAnsi="Arial" w:cs="Arial"/>
-          <w:sz w:val="20"/>
-          <w:lang w:val="uk-UA" w:eastAsia="uk-UA"/>
-        </w:rPr>
-        <w:t>ua.lpnu.kzp.Main</w:t>
-      </w:r>
-      <w:r>
-        <w:rPr>
-          <w:rFonts w:ascii="Arial" w:hAnsi="Arial" w:cs="Arial"/>
-          <w:szCs w:val="24"/>
-          <w:lang w:val="uk-UA" w:eastAsia="uk-UA"/>
-        </w:rPr>
-        <w:t xml:space="preserve"> (точка входу, парсинг, обчислення), допоміжний клас </w:t>
-      </w:r>
-      <w:r>
-        <w:rPr>
-          <w:rFonts w:ascii="Arial" w:hAnsi="Arial" w:cs="Arial"/>
-          <w:sz w:val="20"/>
-          <w:lang w:val="uk-UA" w:eastAsia="uk-UA"/>
-        </w:rPr>
-        <w:t>FileReport</w:t>
-      </w:r>
-      <w:r>
-        <w:rPr>
-          <w:rFonts w:ascii="Arial" w:hAnsi="Arial" w:cs="Arial"/>
-          <w:szCs w:val="24"/>
-          <w:lang w:val="uk-UA" w:eastAsia="uk-UA"/>
-        </w:rPr>
-        <w:t xml:space="preserve"> (читання/запис файлів) та тестовий клас </w:t>
-      </w:r>
-      <w:r>
-        <w:rPr>
-          <w:rFonts w:ascii="Arial" w:hAnsi="Arial" w:cs="Arial"/>
-          <w:sz w:val="20"/>
-          <w:lang w:val="uk-UA" w:eastAsia="uk-UA"/>
-        </w:rPr>
-        <w:t>MainTest</w:t>
-      </w:r>
-      <w:r>
-        <w:rPr>
-          <w:rFonts w:ascii="Arial" w:hAnsi="Arial" w:cs="Arial"/>
-          <w:szCs w:val="24"/>
-          <w:lang w:val="uk-UA" w:eastAsia="uk-UA"/>
-        </w:rPr>
-        <w:t>.</w:t>
+      </w:pPr>
+      <w:r>
+        <w:rPr>
+          <w:rFonts w:ascii="Arial" w:hAnsi="Arial" w:cs="Arial"/>
+          <w:b/>
+          <w:bCs/>
+          <w:szCs w:val="24"/>
+          <w:lang w:val="uk-UA" w:eastAsia="uk-UA"/>
+        </w:rPr>
+        <w:t>Пакети та файли: Проєкт містить головний клас ua.lpnu.kzp.Main (точка входу, аргументи командного рядка, читання та перевірка CSV, обчислення й формування звіту) і тестовий клас MainTest.</w:t>
       </w:r>
     </w:p>
     <w:p>
@@ -2530,25 +2471,43 @@
       <w:pPr>
         <w:tabs>
           <w:tab w:val="clear" w:pos="284"/>
-        </w:tabs>
-        <w:spacing w:after="100" w:afterAutospacing="1" w:line="240" w:lineRule="auto"/>
+          <w:tab w:val="left" w:pos="916"/>
+          <w:tab w:val="left" w:pos="1832"/>
+          <w:tab w:val="left" w:pos="2748"/>
+          <w:tab w:val="left" w:pos="3664"/>
+          <w:tab w:val="left" w:pos="4580"/>
+          <w:tab w:val="left" w:pos="5496"/>
+          <w:tab w:val="left" w:pos="6412"/>
+          <w:tab w:val="left" w:pos="7328"/>
+          <w:tab w:val="left" w:pos="8244"/>
+          <w:tab w:val="left" w:pos="9160"/>
+          <w:tab w:val="left" w:pos="10076"/>
+          <w:tab w:val="left" w:pos="10992"/>
+          <w:tab w:val="left" w:pos="11908"/>
+          <w:tab w:val="left" w:pos="12824"/>
+          <w:tab w:val="left" w:pos="13740"/>
+          <w:tab w:val="left" w:pos="14656"/>
+        </w:tabs>
+        <w:spacing w:line="240" w:lineRule="auto"/>
         <w:ind w:firstLine="0"/>
         <w:jc w:val="left"/>
         <w:rPr>
           <w:rFonts w:ascii="Arial" w:hAnsi="Arial" w:cs="Arial"/>
-          <w:szCs w:val="24"/>
-          <w:lang w:val="uk-UA" w:eastAsia="uk-UA"/>
-        </w:rPr>
-      </w:pPr>
-      <w:r>
-        <w:rPr>
-          <w:rFonts w:ascii="Arial" w:hAnsi="Arial" w:cs="Arial"/>
           <w:b/>
           <w:bCs/>
           <w:szCs w:val="24"/>
           <w:lang w:val="uk-UA" w:eastAsia="uk-UA"/>
         </w:rPr>
-        <w:t>Консольний вивід:</w:t>
+      </w:pPr>
+      <w:r>
+        <w:rPr>
+          <w:rFonts w:ascii="Arial" w:hAnsi="Arial" w:cs="Arial"/>
+          <w:b/>
+          <w:bCs/>
+          <w:szCs w:val="24"/>
+          <w:lang w:val="uk-UA" w:eastAsia="uk-UA"/>
+        </w:rPr>
+        <w:t>Команда запуску (Windows PowerShell, JDK 21): chcp 65001 &gt; $null; &amp; "$env:JAVA_HOME\bin\java.exe" '-Dfile.encoding=UTF-8' -jar target\lab01-1.0.0.jar --input data\input.csv.</w:t>
       </w:r>
     </w:p>
     <w:p>
@@ -2577,17 +2536,21 @@
         <w:jc w:val="left"/>
         <w:rPr>
           <w:rFonts w:ascii="Arial" w:hAnsi="Arial" w:cs="Arial"/>
-          <w:sz w:val="20"/>
-          <w:lang w:val="uk-UA" w:eastAsia="uk-UA"/>
-        </w:rPr>
-      </w:pPr>
-      <w:r>
-        <w:rPr>
-          <w:rFonts w:ascii="Arial" w:hAnsi="Arial" w:cs="Arial"/>
-          <w:sz w:val="20"/>
-          <w:lang w:val="uk-UA" w:eastAsia="uk-UA"/>
-        </w:rPr>
-        <w:t>=== Звіт розсадника рослин (варіант 12) ===</w:t>
+          <w:b/>
+          <w:bCs/>
+          <w:szCs w:val="24"/>
+          <w:lang w:val="uk-UA" w:eastAsia="uk-UA"/>
+        </w:rPr>
+      </w:pPr>
+      <w:r>
+        <w:rPr>
+          <w:rFonts w:ascii="Arial" w:hAnsi="Arial" w:cs="Arial"/>
+          <w:b/>
+          <w:bCs/>
+          <w:szCs w:val="24"/>
+          <w:lang w:val="uk-UA" w:eastAsia="uk-UA"/>
+        </w:rPr>
+        <w:t>Консольний вивід:</w:t>
       </w:r>
     </w:p>
     <w:p>
@@ -2626,7 +2589,7 @@
           <w:sz w:val="20"/>
           <w:lang w:val="uk-UA" w:eastAsia="uk-UA"/>
         </w:rPr>
-        <w:t>Коректних записів: 3</w:t>
+        <w:t>=== Звіт розсадника рослин (варіант 12) ===</w:t>
       </w:r>
     </w:p>
     <w:p>
@@ -2665,7 +2628,7 @@
           <w:sz w:val="20"/>
           <w:lang w:val="uk-UA" w:eastAsia="uk-UA"/>
         </w:rPr>
-        <w:t>Середня висота: 143.50 см</w:t>
+        <w:t>Коректних записів: 3</w:t>
       </w:r>
     </w:p>
     <w:p>
@@ -2704,7 +2667,7 @@
           <w:sz w:val="20"/>
           <w:lang w:val="uk-UA" w:eastAsia="uk-UA"/>
         </w:rPr>
-        <w:t>Найдорожча рослина: Листяні Клен червоний (1200.00 грн)</w:t>
+        <w:t>Середня висота: 143.50 см</w:t>
       </w:r>
     </w:p>
     <w:p>
@@ -2743,7 +2706,7 @@
           <w:sz w:val="20"/>
           <w:lang w:val="uk-UA" w:eastAsia="uk-UA"/>
         </w:rPr>
-        <w:t>Найменший інтервал поливу: 5 днів</w:t>
+        <w:t>Найдорожча рослина: Листяні Клен червоний (1200.00 грн)</w:t>
       </w:r>
     </w:p>
     <w:p>
@@ -2782,7 +2745,7 @@
           <w:sz w:val="20"/>
           <w:lang w:val="uk-UA" w:eastAsia="uk-UA"/>
         </w:rPr>
-        <w:t>Помилок: 2</w:t>
+        <w:t>Найменший інтервал поливу: 5 днів</w:t>
       </w:r>
     </w:p>
     <w:p>
@@ -2821,7 +2784,7 @@
           <w:sz w:val="20"/>
           <w:lang w:val="uk-UA" w:eastAsia="uk-UA"/>
         </w:rPr>
-        <w:t>Рядок 4: species i name не можуть бути порожніми</w:t>
+        <w:t>Помилок: 2</w:t>
       </w:r>
     </w:p>
     <w:p>
@@ -2860,6 +2823,45 @@
           <w:sz w:val="20"/>
           <w:lang w:val="uk-UA" w:eastAsia="uk-UA"/>
         </w:rPr>
+        <w:t>Рядок 4: species і name не можуть бути порожніми</w:t>
+      </w:r>
+    </w:p>
+    <w:p>
+      <w:pPr>
+        <w:tabs>
+          <w:tab w:val="clear" w:pos="284"/>
+          <w:tab w:val="left" w:pos="916"/>
+          <w:tab w:val="left" w:pos="1832"/>
+          <w:tab w:val="left" w:pos="2748"/>
+          <w:tab w:val="left" w:pos="3664"/>
+          <w:tab w:val="left" w:pos="4580"/>
+          <w:tab w:val="left" w:pos="5496"/>
+          <w:tab w:val="left" w:pos="6412"/>
+          <w:tab w:val="left" w:pos="7328"/>
+          <w:tab w:val="left" w:pos="8244"/>
+          <w:tab w:val="left" w:pos="9160"/>
+          <w:tab w:val="left" w:pos="10076"/>
+          <w:tab w:val="left" w:pos="10992"/>
+          <w:tab w:val="left" w:pos="11908"/>
+          <w:tab w:val="left" w:pos="12824"/>
+          <w:tab w:val="left" w:pos="13740"/>
+          <w:tab w:val="left" w:pos="14656"/>
+        </w:tabs>
+        <w:spacing w:line="240" w:lineRule="auto"/>
+        <w:ind w:firstLine="0"/>
+        <w:jc w:val="left"/>
+        <w:rPr>
+          <w:rFonts w:ascii="Arial" w:hAnsi="Arial" w:cs="Arial"/>
+          <w:sz w:val="20"/>
+          <w:lang w:val="uk-UA" w:eastAsia="uk-UA"/>
+        </w:rPr>
+      </w:pPr>
+      <w:r>
+        <w:rPr>
+          <w:rFonts w:ascii="Arial" w:hAnsi="Arial" w:cs="Arial"/>
+          <w:sz w:val="20"/>
+          <w:lang w:val="uk-UA" w:eastAsia="uk-UA"/>
+        </w:rPr>
         <w:t>Рядок 6: неправильний числовий формат</w:t>
       </w:r>
     </w:p>
@@ -3062,6 +3064,7 @@
           <w:szCs w:val="24"/>
           <w:lang w:val="uk-UA" w:eastAsia="uk-UA"/>
         </w:rPr>
+        <w:lastRenderedPageBreak/>
         <w:t>Посилання на CI:</w:t>
       </w:r>
       <w:r>
@@ -3088,25 +3091,7 @@
             <w:sz w:val="20"/>
             <w:lang w:val="uk-UA" w:eastAsia="uk-UA"/>
           </w:rPr>
-          <w:t>https://github.co</w:t>
-        </w:r>
-        <w:r>
-          <w:rPr>
-            <w:rStyle w:val="Hyperlink"/>
-            <w:rFonts w:ascii="Arial" w:hAnsi="Arial" w:cs="Arial"/>
-            <w:sz w:val="20"/>
-            <w:lang w:val="uk-UA" w:eastAsia="uk-UA"/>
-          </w:rPr>
-          <w:t>m</w:t>
-        </w:r>
-        <w:r>
-          <w:rPr>
-            <w:rStyle w:val="Hyperlink"/>
-            <w:rFonts w:ascii="Arial" w:hAnsi="Arial" w:cs="Arial"/>
-            <w:sz w:val="20"/>
-            <w:lang w:val="uk-UA" w:eastAsia="uk-UA"/>
-          </w:rPr>
-          <w:t>/gameruha/kzp-labs/actions</w:t>
+          <w:t>https://github.com/gameruha/kzp-labs/actions</w:t>
         </w:r>
       </w:hyperlink>
       <w:r>
@@ -3226,58 +3211,28 @@
       <w:pPr>
         <w:numPr>
           <w:ilvl w:val="0"/>
-          <w:numId w:val="14"/>
+          <w:numId w:val="3"/>
         </w:numPr>
         <w:tabs>
           <w:tab w:val="clear" w:pos="284"/>
         </w:tabs>
         <w:spacing w:after="100" w:afterAutospacing="1" w:line="240" w:lineRule="auto"/>
+        <w:ind w:left="0"/>
         <w:jc w:val="left"/>
-        <w:rPr>
-          <w:rFonts w:ascii="Arial" w:hAnsi="Arial" w:cs="Arial"/>
-          <w:szCs w:val="24"/>
-          <w:lang w:val="uk-UA" w:eastAsia="uk-UA"/>
-        </w:rPr>
-      </w:pPr>
-      <w:r>
-        <w:rPr>
-          <w:rFonts w:ascii="Arial" w:hAnsi="Arial" w:cs="Arial"/>
-          <w:szCs w:val="24"/>
-          <w:lang w:val="uk-UA" w:eastAsia="uk-UA"/>
-        </w:rPr>
-        <w:t xml:space="preserve">Javadoc-коментарями описано публічний клас </w:t>
-      </w:r>
-      <w:r>
-        <w:rPr>
-          <w:rFonts w:ascii="Arial" w:hAnsi="Arial" w:cs="Arial"/>
-          <w:sz w:val="20"/>
-          <w:lang w:val="uk-UA" w:eastAsia="uk-UA"/>
-        </w:rPr>
-        <w:t>Main</w:t>
-      </w:r>
-      <w:r>
-        <w:rPr>
-          <w:rFonts w:ascii="Arial" w:hAnsi="Arial" w:cs="Arial"/>
-          <w:szCs w:val="24"/>
-          <w:lang w:val="uk-UA" w:eastAsia="uk-UA"/>
-        </w:rPr>
-        <w:t xml:space="preserve">, точку входу </w:t>
-      </w:r>
-      <w:r>
-        <w:rPr>
-          <w:rFonts w:ascii="Arial" w:hAnsi="Arial" w:cs="Arial"/>
-          <w:sz w:val="20"/>
-          <w:lang w:val="uk-UA" w:eastAsia="uk-UA"/>
-        </w:rPr>
-        <w:t>main</w:t>
-      </w:r>
-      <w:r>
-        <w:rPr>
-          <w:rFonts w:ascii="Arial" w:hAnsi="Arial" w:cs="Arial"/>
-          <w:szCs w:val="24"/>
-          <w:lang w:val="uk-UA" w:eastAsia="uk-UA"/>
-        </w:rPr>
-        <w:t>, а також допоміжні методи кросплатформної роботи з файлами.</w:t>
+        <w:outlineLvl w:val="1"/>
+        <w:rPr>
+          <w:rFonts w:ascii="Arial" w:hAnsi="Arial" w:cs="Arial"/>
+          <w:szCs w:val="24"/>
+          <w:lang w:val="uk-UA" w:eastAsia="uk-UA"/>
+        </w:rPr>
+      </w:pPr>
+      <w:r>
+        <w:rPr>
+          <w:rFonts w:ascii="Arial" w:hAnsi="Arial" w:cs="Arial"/>
+          <w:szCs w:val="24"/>
+          <w:lang w:val="uk-UA" w:eastAsia="uk-UA"/>
+        </w:rPr>
+        <w:t>Javadoc-коментарями описано публічний клас Main, точку входу main, методи analyze, formatReport і writeReport, а також записи Plant і Analysis.</w:t>
       </w:r>
     </w:p>
     <w:p>
@@ -3461,13 +3416,15 @@
       <w:pPr>
         <w:numPr>
           <w:ilvl w:val="0"/>
-          <w:numId w:val="15"/>
+          <w:numId w:val="3"/>
         </w:numPr>
         <w:tabs>
           <w:tab w:val="clear" w:pos="284"/>
         </w:tabs>
         <w:spacing w:after="100" w:afterAutospacing="1" w:line="240" w:lineRule="auto"/>
+        <w:ind w:left="0"/>
         <w:jc w:val="left"/>
+        <w:outlineLvl w:val="1"/>
         <w:rPr>
           <w:rFonts w:ascii="Arial" w:hAnsi="Arial" w:cs="Arial"/>
           <w:szCs w:val="24"/>
@@ -3482,15 +3439,15 @@
           <w:szCs w:val="24"/>
           <w:lang w:val="uk-UA" w:eastAsia="uk-UA"/>
         </w:rPr>
-        <w:t>Внесок автора:</w:t>
-      </w:r>
-      <w:r>
-        <w:rPr>
-          <w:rFonts w:ascii="Arial" w:hAnsi="Arial" w:cs="Arial"/>
-          <w:szCs w:val="24"/>
-          <w:lang w:val="uk-UA" w:eastAsia="uk-UA"/>
-        </w:rPr>
-        <w:t xml:space="preserve"> Самостійно реалізовано алгоритм обробки рядків, фільтрації даних, розроблено тестові набори. Автор розуміє та може пояснити кожен рядок коду, що знаходиться в репозиторії. </w:t>
+        <w:t xml:space="preserve">Внесок автора: </w:t>
+      </w:r>
+      <w:r>
+        <w:rPr>
+          <w:rFonts w:ascii="Arial" w:hAnsi="Arial" w:cs="Arial"/>
+          <w:szCs w:val="24"/>
+          <w:lang w:val="uk-UA" w:eastAsia="uk-UA"/>
+        </w:rPr>
+        <w:t>визначення варіанта й вимог, підготовка прикладових CSV-даних, перевірка результатів і запуск тестів та Maven-перевірок. Внесок GitHub Copilot: допомога з аналізом вимог, окремими змінами коду, тестами й документацією. Автор перевіряє остаточний результат і відповідає за поданий код.</w:t>
       </w:r>
     </w:p>
     <w:p>
@@ -3868,6 +3825,7 @@
           <w:szCs w:val="24"/>
           <w:lang w:val="uk-UA" w:eastAsia="uk-UA"/>
         </w:rPr>
+        <w:lastRenderedPageBreak/>
         <w:t>Чому не можна мовчки пропускати рядок із помилкою?</w:t>
       </w:r>
       <w:r>
@@ -3904,7 +3862,6 @@
           <w:szCs w:val="24"/>
           <w:lang w:val="uk-UA" w:eastAsia="uk-UA"/>
         </w:rPr>
-        <w:lastRenderedPageBreak/>
         <w:t>Як String.split(";", -1) обробляє порожнє останнє поле?</w:t>
       </w:r>
       <w:r>
@@ -4115,75 +4072,21 @@
         <w:jc w:val="left"/>
         <w:rPr>
           <w:rFonts w:ascii="Arial" w:hAnsi="Arial" w:cs="Arial"/>
-          <w:szCs w:val="24"/>
-          <w:lang w:val="uk-UA" w:eastAsia="uk-UA"/>
-        </w:rPr>
-      </w:pPr>
-      <w:r>
-        <w:rPr>
-          <w:rFonts w:ascii="Arial" w:hAnsi="Arial" w:cs="Arial"/>
           <w:b/>
           <w:bCs/>
           <w:szCs w:val="24"/>
           <w:lang w:val="uk-UA" w:eastAsia="uk-UA"/>
         </w:rPr>
-        <w:t>Які дані потрібно перевірити у вашому варіанті?</w:t>
-      </w:r>
-      <w:r>
-        <w:rPr>
-          <w:rFonts w:ascii="Arial" w:hAnsi="Arial" w:cs="Arial"/>
-          <w:szCs w:val="24"/>
-          <w:lang w:val="uk-UA" w:eastAsia="uk-UA"/>
-        </w:rPr>
-        <w:t xml:space="preserve"> Обов'язкова наявність усіх 5 полів, невід'ємність висоти (</w:t>
-      </w:r>
-      <w:r>
-        <w:rPr>
-          <w:rFonts w:ascii="Arial" w:hAnsi="Arial" w:cs="Arial"/>
-          <w:sz w:val="20"/>
-          <w:lang w:val="uk-UA" w:eastAsia="uk-UA"/>
-        </w:rPr>
-        <w:t>heightCm</w:t>
-      </w:r>
-      <w:r>
-        <w:rPr>
-          <w:rFonts w:ascii="Arial" w:hAnsi="Arial" w:cs="Arial"/>
-          <w:szCs w:val="24"/>
-          <w:lang w:val="uk-UA" w:eastAsia="uk-UA"/>
-        </w:rPr>
-        <w:t>), ціни (</w:t>
-      </w:r>
-      <w:r>
-        <w:rPr>
-          <w:rFonts w:ascii="Arial" w:hAnsi="Arial" w:cs="Arial"/>
-          <w:sz w:val="20"/>
-          <w:lang w:val="uk-UA" w:eastAsia="uk-UA"/>
-        </w:rPr>
-        <w:t>price</w:t>
-      </w:r>
-      <w:r>
-        <w:rPr>
-          <w:rFonts w:ascii="Arial" w:hAnsi="Arial" w:cs="Arial"/>
-          <w:szCs w:val="24"/>
-          <w:lang w:val="uk-UA" w:eastAsia="uk-UA"/>
-        </w:rPr>
-        <w:t>) та інтервалу поливу (</w:t>
-      </w:r>
-      <w:r>
-        <w:rPr>
-          <w:rFonts w:ascii="Arial" w:hAnsi="Arial" w:cs="Arial"/>
-          <w:sz w:val="20"/>
-          <w:lang w:val="uk-UA" w:eastAsia="uk-UA"/>
-        </w:rPr>
-        <w:t>wateringDays</w:t>
-      </w:r>
-      <w:r>
-        <w:rPr>
-          <w:rFonts w:ascii="Arial" w:hAnsi="Arial" w:cs="Arial"/>
-          <w:szCs w:val="24"/>
-          <w:lang w:val="uk-UA" w:eastAsia="uk-UA"/>
-        </w:rPr>
-        <w:t xml:space="preserve">), а також валідність числових форматів. </w:t>
+      </w:pPr>
+      <w:r>
+        <w:rPr>
+          <w:rFonts w:ascii="Arial" w:hAnsi="Arial" w:cs="Arial"/>
+          <w:b/>
+          <w:bCs/>
+          <w:szCs w:val="24"/>
+          <w:lang w:val="uk-UA" w:eastAsia="uk-UA"/>
+        </w:rPr>
+        <w:t>Які дані потрібно перевірити у вашому варіанті? Потрібно перевірити кількість полів (5), непорожні species і name та числові формати. heightCm має бути скінченною і строго додатною величиною; price — скінченним і невід’ємним; wateringDays — цілим додатним числом. NaN та Infinity відхиляються.</w:t>
       </w:r>
     </w:p>
     <w:p>
@@ -4422,20 +4325,15 @@
       <w:pPr>
         <w:numPr>
           <w:ilvl w:val="0"/>
-          <w:numId w:val="16"/>
+          <w:numId w:val="3"/>
         </w:numPr>
         <w:tabs>
           <w:tab w:val="clear" w:pos="284"/>
         </w:tabs>
         <w:spacing w:after="100" w:afterAutospacing="1" w:line="240" w:lineRule="auto"/>
+        <w:ind w:left="0"/>
         <w:jc w:val="left"/>
-        <w:rPr>
-          <w:rFonts w:ascii="Arial" w:hAnsi="Arial" w:cs="Arial"/>
-          <w:szCs w:val="24"/>
-          <w:lang w:val="uk-UA" w:eastAsia="uk-UA"/>
-        </w:rPr>
-      </w:pPr>
-      <w:r>
+        <w:outlineLvl w:val="1"/>
         <w:rPr>
           <w:rFonts w:ascii="Arial" w:hAnsi="Arial" w:cs="Arial"/>
           <w:b/>
@@ -4443,47 +4341,16 @@
           <w:szCs w:val="24"/>
           <w:lang w:val="uk-UA" w:eastAsia="uk-UA"/>
         </w:rPr>
-        <w:t>Який рядок вашої програми найскладніше пояснити і чому?</w:t>
-      </w:r>
-      <w:r>
-        <w:rPr>
-          <w:rFonts w:ascii="Arial" w:hAnsi="Arial" w:cs="Arial"/>
-          <w:szCs w:val="24"/>
-          <w:lang w:val="uk-UA" w:eastAsia="uk-UA"/>
-        </w:rPr>
-        <w:t xml:space="preserve"> Найскладнішим є блок </w:t>
-      </w:r>
-      <w:r>
-        <w:rPr>
-          <w:rFonts w:ascii="Arial" w:hAnsi="Arial" w:cs="Arial"/>
-          <w:sz w:val="20"/>
-          <w:lang w:val="uk-UA" w:eastAsia="uk-UA"/>
-        </w:rPr>
-        <w:t>try-catch</w:t>
-      </w:r>
-      <w:r>
-        <w:rPr>
-          <w:rFonts w:ascii="Arial" w:hAnsi="Arial" w:cs="Arial"/>
-          <w:szCs w:val="24"/>
-          <w:lang w:val="uk-UA" w:eastAsia="uk-UA"/>
-        </w:rPr>
-        <w:t xml:space="preserve"> з парсингом числових значень та одночасною перевіркою на від'ємність і </w:t>
-      </w:r>
-      <w:r>
-        <w:rPr>
-          <w:rFonts w:ascii="Arial" w:hAnsi="Arial" w:cs="Arial"/>
-          <w:sz w:val="20"/>
-          <w:lang w:val="uk-UA" w:eastAsia="uk-UA"/>
-        </w:rPr>
-        <w:t>NaN</w:t>
-      </w:r>
-      <w:r>
-        <w:rPr>
-          <w:rFonts w:ascii="Arial" w:hAnsi="Arial" w:cs="Arial"/>
-          <w:szCs w:val="24"/>
-          <w:lang w:val="uk-UA" w:eastAsia="uk-UA"/>
-        </w:rPr>
-        <w:t>, оскільки він поєднує обробку логічних помилок даних з обробкою системних винятків Java.</w:t>
+      </w:pPr>
+      <w:r>
+        <w:rPr>
+          <w:rFonts w:ascii="Arial" w:hAnsi="Arial" w:cs="Arial"/>
+          <w:b/>
+          <w:bCs/>
+          <w:szCs w:val="24"/>
+          <w:lang w:val="uk-UA" w:eastAsia="uk-UA"/>
+        </w:rPr>
+        <w:t>Який рядок вашої програми найскладніше пояснити і чому? Найскладнішим для пояснення є фрагмент парсингу чисел і подальшої валідації: NumberFormatException обробляє некоректний формат, а окрема умова відхиляє NaN, Infinity та значення поза допустимими межами.</w:t>
       </w:r>
     </w:p>
     <w:p>
@@ -4540,16 +4407,8 @@
           <w:szCs w:val="24"/>
           <w:lang w:val="uk-UA" w:eastAsia="uk-UA"/>
         </w:rPr>
-        <w:t xml:space="preserve">У ході виконання лабораторної роботи розгорнуто відтворюваний Java-проєкт, налаштовано систему збірки Maven, підключено JUnit 5 та статичний аналізатор SpotBugs. Створено консольну програму для обробки даних розсадника рослин, яка коректно ізолює пошкоджені записи та формує звіти. Для максимального рівня розгорнуто пайплайн CI/CD у GitHub Actions, який автоматично тестує програму на трьох ОС і генерує артефакти. Цей консольний застосунок та налаштована </w:t>
-      </w:r>
-      <w:r>
-        <w:rPr>
-          <w:rFonts w:ascii="Arial" w:hAnsi="Arial" w:cs="Arial"/>
-          <w:szCs w:val="24"/>
-          <w:lang w:val="uk-UA" w:eastAsia="uk-UA"/>
-        </w:rPr>
         <w:lastRenderedPageBreak/>
-        <w:t xml:space="preserve">інфраструктура стануть міцною основою для лабораторної роботи №2, де процедурну обробку рядків буде замінено на об'єктно-орієнтовані класи. </w:t>
+        <w:t xml:space="preserve">У ході виконання лабораторної роботи розгорнуто відтворюваний Java-проєкт, налаштовано систему збірки Maven, підключено JUnit 5 та статичний аналізатор SpotBugs. Створено консольну програму для обробки даних розсадника рослин, яка коректно ізолює пошкоджені записи та формує звіти. Для максимального рівня розгорнуто пайплайн CI/CD у GitHub Actions, який автоматично тестує програму на трьох ОС і генерує артефакти. Цей консольний застосунок та налаштована інфраструктура стануть міцною основою для лабораторної роботи №2, де процедурну обробку рядків буде замінено на об'єктно-орієнтовані класи. </w:t>
       </w:r>
     </w:p>
     <w:p>
@@ -6255,7 +6114,7 @@
   <w:abstractNum w:abstractNumId="9" w15:restartNumberingAfterBreak="0">
     <w:nsid w:val="5A815450"/>
     <w:multiLevelType w:val="multilevel"/>
-    <w:tmpl w:val="348E9CA2"/>
+    <w:tmpl w:val="10F259C6"/>
     <w:lvl w:ilvl="0">
       <w:start w:val="1"/>
       <w:numFmt w:val="decimal"/>
@@ -6263,10 +6122,14 @@
       <w:lvlText w:val="%1."/>
       <w:lvlJc w:val="left"/>
       <w:pPr>
-        <w:ind w:left="709" w:firstLine="0"/>
+        <w:ind w:left="284" w:firstLine="0"/>
       </w:pPr>
       <w:rPr>
         <w:rFonts w:hint="default"/>
+        <w:b/>
+        <w:bCs/>
+        <w:sz w:val="36"/>
+        <w:szCs w:val="36"/>
       </w:rPr>
     </w:lvl>
     <w:lvl w:ilvl="1">

</xml_diff>